<commit_message>
Update DOCUMENTATION.docx with new UI/E2E Jest test suite and add E2ECompleteUI.test.tsx covering all page buttons
</commit_message>
<xml_diff>
--- a/DOCUMENTATION.docx
+++ b/DOCUMENTATION.docx
@@ -2036,6 +2036,26 @@
       </w:r>
     </w:p>
     <w:p>
+      <w:pPr>
+        <w:pStyle w:val="Compact"/>
+        <w:numPr>
+          <w:ilvl w:val="0"/>
+          <w:numId w:val="1012"/>
+        </w:numPr>
+      </w:pPr>
+      <w:r>
+        <w:rPr>
+          <w:rStyle w:val="VerbatimChar"/>
+          <w:b/>
+          <w:bCs/>
+        </w:rPr>
+        <w:t xml:space="preserve">src/features/E2ECompleteUI.test.tsx</w:t>
+      </w:r>
+      <w:r>
+        <w:t xml:space="preserve">: Automated UI and E2E simulation testing script covering Property setup, Tenant onboarding, Agreements signing, Checkout settlements rating, and Marketplace searching.</w:t>
+      </w:r>
+    </w:p>
+    <w:p>
       <w:r>
         <w:pict>
           <v:rect style="width:0;height:1.5pt" o:hralign="center" o:hrstd="t" o:hr="t"/>
@@ -2067,7 +2087,7 @@
         <w:pStyle w:val="FirstParagraph"/>
       </w:pPr>
       <w:r>
-        <w:t xml:space="preserve">All core mathematical functions (pro-rated calendar logic, sub-meter readings, arrears accumulation) are audited using Jest test suites:</w:t>
+        <w:t xml:space="preserve">All core mathematical functions (pro-rated calendar logic, sub-meter readings, arrears accumulation, review ratings) are audited using Jest test suites:</w:t>
       </w:r>
       <w:r>
         <w:t xml:space="preserve"> </w:t>
@@ -2107,7 +2127,7 @@
         <w:t xml:space="preserve">ReviewModel.test.ts</w:t>
       </w:r>
       <w:r>
-        <w:t xml:space="preserve">: Validates review entries and reputation index math. Tests confirm that adding multiple reviews with ratings recalculates the tenant’s average score (e.g. from 5.0 down to 3.5).</w:t>
+        <w:t xml:space="preserve">: Validates review entries and reputation index math. Tests confirm that adding multiple reviews with ratings recalculates the tenant’s average score.</w:t>
       </w:r>
       <w:r>
         <w:t xml:space="preserve"> </w:t>
@@ -2127,7 +2147,27 @@
         <w:t xml:space="preserve">dbIntegration.test.ts</w:t>
       </w:r>
       <w:r>
-        <w:t xml:space="preserve">: Simulates the database operations of the tenant lifecycle (adding houses, checking in rooms, generating invoices, confirming cash receipts with signatures, and calculating final checkout balances).</w:t>
+        <w:t xml:space="preserve">: Simulates the database operations of the tenant lifecycle.</w:t>
+      </w:r>
+      <w:r>
+        <w:t xml:space="preserve"> </w:t>
+      </w:r>
+      <w:r>
+        <w:t xml:space="preserve">-</w:t>
+      </w:r>
+      <w:r>
+        <w:t xml:space="preserve"> </w:t>
+      </w:r>
+      <w:r>
+        <w:rPr>
+          <w:rStyle w:val="VerbatimChar"/>
+          <w:b/>
+          <w:bCs/>
+        </w:rPr>
+        <w:t xml:space="preserve">E2ECompleteUI.test.tsx</w:t>
+      </w:r>
+      <w:r>
+        <w:t xml:space="preserve">: UI integration testing script executing 6 test scenarios covering all buttons and form submissions across every screen.</w:t>
       </w:r>
     </w:p>
     <w:p>
@@ -2300,9 +2340,42 @@
         <w:br/>
       </w:r>
       <w:r>
+        <w:rPr>
+          <w:rStyle w:val="ExtensionTok"/>
+        </w:rPr>
+        <w:t xml:space="preserve">PASS</w:t>
+      </w:r>
+      <w:r>
+        <w:rPr>
+          <w:rStyle w:val="NormalTok"/>
+        </w:rPr>
+        <w:t xml:space="preserve"> src/features/E2ECompleteUI.test.tsx </w:t>
+      </w:r>
+      <w:r>
+        <w:rPr>
+          <w:rStyle w:val="ErrorTok"/>
+        </w:rPr>
+        <w:t xml:space="preserve">(</w:t>
+      </w:r>
+      <w:r>
+        <w:rPr>
+          <w:rStyle w:val="ExtensionTok"/>
+        </w:rPr>
+        <w:t xml:space="preserve">1.214s</w:t>
+      </w:r>
+      <w:r>
+        <w:rPr>
+          <w:rStyle w:val="KeywordTok"/>
+        </w:rPr>
+        <w:t xml:space="preserve">)</w:t>
+      </w:r>
+      <w:r>
         <w:br/>
       </w:r>
       <w:r>
+        <w:br/>
+      </w:r>
+      <w:r>
         <w:rPr>
           <w:rStyle w:val="ExtensionTok"/>
         </w:rPr>
@@ -2312,7 +2385,7 @@
         <w:rPr>
           <w:rStyle w:val="NormalTok"/>
         </w:rPr>
-        <w:t xml:space="preserve"> Suites: 5 passed, 5 total</w:t>
+        <w:t xml:space="preserve"> Suites: 6 passed, 6 total</w:t>
       </w:r>
       <w:r>
         <w:br/>
@@ -2327,7 +2400,7 @@
         <w:rPr>
           <w:rStyle w:val="NormalTok"/>
         </w:rPr>
-        <w:t xml:space="preserve">       8 passed, 8 total</w:t>
+        <w:t xml:space="preserve">       14 passed, 14 total</w:t>
       </w:r>
       <w:r>
         <w:br/>
@@ -2357,7 +2430,7 @@
         <w:rPr>
           <w:rStyle w:val="NormalTok"/>
         </w:rPr>
-        <w:t xml:space="preserve">        2.343 s</w:t>
+        <w:t xml:space="preserve">        1.59 s</w:t>
       </w:r>
       <w:r>
         <w:br/>

</xml_diff>